<commit_message>
Report: add Nikhil Halambi (PRN 23070521099) as co-author
</commit_message>
<xml_diff>
--- a/report/Wearable_Strain_Stratification_Report.docx
+++ b/report/Wearable_Strain_Stratification_Report.docx
@@ -55,10 +55,12 @@
       <w:r>
         <w:rPr>
           <w:rFonts w:ascii="Arial" w:cs="Arial" w:eastAsia="Arial" w:hAnsi="Arial"/>
+          <w:b/>
+          <w:bCs/>
           <w:sz w:val="24"/>
           <w:szCs w:val="24"/>
         </w:rPr>
-        <w:t xml:space="preserve">Submitted by: Hardik Jain</w:t>
+        <w:t xml:space="preserve">Submitted by</w:t>
       </w:r>
     </w:p>
     <w:p>
@@ -71,7 +73,20 @@
           <w:sz w:val="24"/>
           <w:szCs w:val="24"/>
         </w:rPr>
-        <w:t xml:space="preserve">PRN: 23070521056</w:t>
+        <w:t xml:space="preserve">Hardik Jain (PRN: 23070521056)</w:t>
+      </w:r>
+    </w:p>
+    <w:p>
+      <w:pPr>
+        <w:jc w:val="center"/>
+      </w:pPr>
+      <w:r>
+        <w:rPr>
+          <w:rFonts w:ascii="Arial" w:cs="Arial" w:eastAsia="Arial" w:hAnsi="Arial"/>
+          <w:sz w:val="24"/>
+          <w:szCs w:val="24"/>
+        </w:rPr>
+        <w:t xml:space="preserve">Nikhil Halambi (PRN: 23070521099)</w:t>
       </w:r>
     </w:p>
     <w:p>

</xml_diff>